<commit_message>
docs: set document properties of the Chapter 8 and 9 report
Author and title are now the team's instead of the generator defaults.

Co-Authored-By: Claude Sonnet 5.5 <noreply@anthropic.com>
</commit_message>
<xml_diff>
--- a/docs/ch8-ch9/EcoCommute_Team6_Ch8-Ch9_Architecture_Definition_Form.docx
+++ b/docs/ch8-ch9/EcoCommute_Team6_Ch8-Ch9_Architecture_Definition_Form.docx
@@ -76,7 +76,7 @@
       <w:pPr>
         <w:pStyle w:val="1"/>
       </w:pPr>
-      <w:bookmarkStart w:id="0" w:name="_Toc244249497"/>
+      <w:bookmarkStart w:id="0" w:name="_Toc244249873"/>
       <w:r>
         <w:t>Team Contribution</w:t>
       </w:r>
@@ -498,7 +498,7 @@
       <w:r>
         <w:fldChar w:fldCharType="separate"/>
       </w:r>
-      <w:hyperlink w:anchor="_Toc244249497" w:history="1">
+      <w:hyperlink w:anchor="_Toc244249873" w:history="1">
         <w:r>
           <w:rPr>
             <w:rStyle w:val="aff9"/>
@@ -535,7 +535,7 @@
             <w:noProof/>
             <w:webHidden/>
           </w:rPr>
-          <w:instrText>PAGEREF _Toc244249497 \h</w:instrText>
+          <w:instrText>PAGEREF _Toc244249873 \h</w:instrText>
         </w:r>
         <w:r>
           <w:rPr>
@@ -592,7 +592,7 @@
           <w14:ligatures w14:val="standardContextual"/>
         </w:rPr>
       </w:pPr>
-      <w:hyperlink w:anchor="_Toc244249498" w:history="1">
+      <w:hyperlink w:anchor="_Toc244249874" w:history="1">
         <w:r>
           <w:rPr>
             <w:rStyle w:val="aff9"/>
@@ -629,7 +629,7 @@
             <w:noProof/>
             <w:webHidden/>
           </w:rPr>
-          <w:instrText>PAGEREF _Toc244249498 \h</w:instrText>
+          <w:instrText>PAGEREF _Toc244249874 \h</w:instrText>
         </w:r>
         <w:r>
           <w:rPr>
@@ -687,7 +687,7 @@
           <w14:ligatures w14:val="standardContextual"/>
         </w:rPr>
       </w:pPr>
-      <w:hyperlink w:anchor="_Toc244249499" w:history="1">
+      <w:hyperlink w:anchor="_Toc244249875" w:history="1">
         <w:r>
           <w:rPr>
             <w:rStyle w:val="aff9"/>
@@ -724,7 +724,7 @@
             <w:noProof/>
             <w:webHidden/>
           </w:rPr>
-          <w:instrText>PAGEREF _Toc244249499 \h</w:instrText>
+          <w:instrText>PAGEREF _Toc244249875 \h</w:instrText>
         </w:r>
         <w:r>
           <w:rPr>
@@ -782,7 +782,7 @@
           <w14:ligatures w14:val="standardContextual"/>
         </w:rPr>
       </w:pPr>
-      <w:hyperlink w:anchor="_Toc244249500" w:history="1">
+      <w:hyperlink w:anchor="_Toc244249876" w:history="1">
         <w:r>
           <w:rPr>
             <w:rStyle w:val="aff9"/>
@@ -819,7 +819,7 @@
             <w:noProof/>
             <w:webHidden/>
           </w:rPr>
-          <w:instrText>PAGEREF _Toc244249500 \h</w:instrText>
+          <w:instrText>PAGEREF _Toc244249876 \h</w:instrText>
         </w:r>
         <w:r>
           <w:rPr>
@@ -876,7 +876,7 @@
           <w14:ligatures w14:val="standardContextual"/>
         </w:rPr>
       </w:pPr>
-      <w:hyperlink w:anchor="_Toc244249501" w:history="1">
+      <w:hyperlink w:anchor="_Toc244249877" w:history="1">
         <w:r>
           <w:rPr>
             <w:rStyle w:val="aff9"/>
@@ -913,7 +913,7 @@
             <w:noProof/>
             <w:webHidden/>
           </w:rPr>
-          <w:instrText>PAGEREF _Toc244249501 \h</w:instrText>
+          <w:instrText>PAGEREF _Toc244249877 \h</w:instrText>
         </w:r>
         <w:r>
           <w:rPr>
@@ -971,7 +971,7 @@
           <w14:ligatures w14:val="standardContextual"/>
         </w:rPr>
       </w:pPr>
-      <w:hyperlink w:anchor="_Toc244249502" w:history="1">
+      <w:hyperlink w:anchor="_Toc244249878" w:history="1">
         <w:r>
           <w:rPr>
             <w:rStyle w:val="aff9"/>
@@ -1008,7 +1008,7 @@
             <w:noProof/>
             <w:webHidden/>
           </w:rPr>
-          <w:instrText>PAGEREF _Toc244249502 \h</w:instrText>
+          <w:instrText>PAGEREF _Toc244249878 \h</w:instrText>
         </w:r>
         <w:r>
           <w:rPr>
@@ -1066,7 +1066,7 @@
           <w14:ligatures w14:val="standardContextual"/>
         </w:rPr>
       </w:pPr>
-      <w:hyperlink w:anchor="_Toc244249503" w:history="1">
+      <w:hyperlink w:anchor="_Toc244249879" w:history="1">
         <w:r>
           <w:rPr>
             <w:rStyle w:val="aff9"/>
@@ -1103,7 +1103,7 @@
             <w:noProof/>
             <w:webHidden/>
           </w:rPr>
-          <w:instrText>PAGEREF _Toc244249503 \h</w:instrText>
+          <w:instrText>PAGEREF _Toc244249879 \h</w:instrText>
         </w:r>
         <w:r>
           <w:rPr>
@@ -1161,7 +1161,7 @@
           <w14:ligatures w14:val="standardContextual"/>
         </w:rPr>
       </w:pPr>
-      <w:hyperlink w:anchor="_Toc244249504" w:history="1">
+      <w:hyperlink w:anchor="_Toc244249880" w:history="1">
         <w:r>
           <w:rPr>
             <w:rStyle w:val="aff9"/>
@@ -1198,7 +1198,7 @@
             <w:noProof/>
             <w:webHidden/>
           </w:rPr>
-          <w:instrText>PAGEREF _Toc244249504 \h</w:instrText>
+          <w:instrText>PAGEREF _Toc244249880 \h</w:instrText>
         </w:r>
         <w:r>
           <w:rPr>
@@ -1256,7 +1256,7 @@
           <w14:ligatures w14:val="standardContextual"/>
         </w:rPr>
       </w:pPr>
-      <w:hyperlink w:anchor="_Toc244249505" w:history="1">
+      <w:hyperlink w:anchor="_Toc244249881" w:history="1">
         <w:r>
           <w:rPr>
             <w:rStyle w:val="aff9"/>
@@ -1293,7 +1293,7 @@
             <w:noProof/>
             <w:webHidden/>
           </w:rPr>
-          <w:instrText>PAGEREF _Toc244249505 \h</w:instrText>
+          <w:instrText>PAGEREF _Toc244249881 \h</w:instrText>
         </w:r>
         <w:r>
           <w:rPr>
@@ -1351,7 +1351,7 @@
           <w14:ligatures w14:val="standardContextual"/>
         </w:rPr>
       </w:pPr>
-      <w:hyperlink w:anchor="_Toc244249506" w:history="1">
+      <w:hyperlink w:anchor="_Toc244249882" w:history="1">
         <w:r>
           <w:rPr>
             <w:rStyle w:val="aff9"/>
@@ -1388,7 +1388,7 @@
             <w:noProof/>
             <w:webHidden/>
           </w:rPr>
-          <w:instrText>PAGEREF _Toc244249506 \h</w:instrText>
+          <w:instrText>PAGEREF _Toc244249882 \h</w:instrText>
         </w:r>
         <w:r>
           <w:rPr>
@@ -1446,7 +1446,7 @@
           <w14:ligatures w14:val="standardContextual"/>
         </w:rPr>
       </w:pPr>
-      <w:hyperlink w:anchor="_Toc244249507" w:history="1">
+      <w:hyperlink w:anchor="_Toc244249883" w:history="1">
         <w:r>
           <w:rPr>
             <w:rStyle w:val="aff9"/>
@@ -1483,7 +1483,7 @@
             <w:noProof/>
             <w:webHidden/>
           </w:rPr>
-          <w:instrText>PAGEREF _Toc244249507 \h</w:instrText>
+          <w:instrText>PAGEREF _Toc244249883 \h</w:instrText>
         </w:r>
         <w:r>
           <w:rPr>
@@ -1541,7 +1541,7 @@
           <w14:ligatures w14:val="standardContextual"/>
         </w:rPr>
       </w:pPr>
-      <w:hyperlink w:anchor="_Toc244249508" w:history="1">
+      <w:hyperlink w:anchor="_Toc244249884" w:history="1">
         <w:r>
           <w:rPr>
             <w:rStyle w:val="aff9"/>
@@ -1578,7 +1578,7 @@
             <w:noProof/>
             <w:webHidden/>
           </w:rPr>
-          <w:instrText>PAGEREF _Toc244249508 \h</w:instrText>
+          <w:instrText>PAGEREF _Toc244249884 \h</w:instrText>
         </w:r>
         <w:r>
           <w:rPr>
@@ -1636,7 +1636,7 @@
           <w14:ligatures w14:val="standardContextual"/>
         </w:rPr>
       </w:pPr>
-      <w:hyperlink w:anchor="_Toc244249509" w:history="1">
+      <w:hyperlink w:anchor="_Toc244249885" w:history="1">
         <w:r>
           <w:rPr>
             <w:rStyle w:val="aff9"/>
@@ -1673,7 +1673,7 @@
             <w:noProof/>
             <w:webHidden/>
           </w:rPr>
-          <w:instrText>PAGEREF _Toc244249509 \h</w:instrText>
+          <w:instrText>PAGEREF _Toc244249885 \h</w:instrText>
         </w:r>
         <w:r>
           <w:rPr>
@@ -1731,7 +1731,7 @@
           <w14:ligatures w14:val="standardContextual"/>
         </w:rPr>
       </w:pPr>
-      <w:hyperlink w:anchor="_Toc244249510" w:history="1">
+      <w:hyperlink w:anchor="_Toc244249886" w:history="1">
         <w:r>
           <w:rPr>
             <w:rStyle w:val="aff9"/>
@@ -1768,7 +1768,7 @@
             <w:noProof/>
             <w:webHidden/>
           </w:rPr>
-          <w:instrText>PAGEREF _Toc244249510 \h</w:instrText>
+          <w:instrText>PAGEREF _Toc244249886 \h</w:instrText>
         </w:r>
         <w:r>
           <w:rPr>
@@ -1826,7 +1826,7 @@
           <w14:ligatures w14:val="standardContextual"/>
         </w:rPr>
       </w:pPr>
-      <w:hyperlink w:anchor="_Toc244249511" w:history="1">
+      <w:hyperlink w:anchor="_Toc244249887" w:history="1">
         <w:r>
           <w:rPr>
             <w:rStyle w:val="aff9"/>
@@ -1863,7 +1863,7 @@
             <w:noProof/>
             <w:webHidden/>
           </w:rPr>
-          <w:instrText>PAGEREF _Toc244249511 \h</w:instrText>
+          <w:instrText>PAGEREF _Toc244249887 \h</w:instrText>
         </w:r>
         <w:r>
           <w:rPr>
@@ -1921,7 +1921,7 @@
           <w14:ligatures w14:val="standardContextual"/>
         </w:rPr>
       </w:pPr>
-      <w:hyperlink w:anchor="_Toc244249512" w:history="1">
+      <w:hyperlink w:anchor="_Toc244249888" w:history="1">
         <w:r>
           <w:rPr>
             <w:rStyle w:val="aff9"/>
@@ -1958,7 +1958,7 @@
             <w:noProof/>
             <w:webHidden/>
           </w:rPr>
-          <w:instrText>PAGEREF _Toc244249512 \h</w:instrText>
+          <w:instrText>PAGEREF _Toc244249888 \h</w:instrText>
         </w:r>
         <w:r>
           <w:rPr>
@@ -2016,7 +2016,7 @@
           <w14:ligatures w14:val="standardContextual"/>
         </w:rPr>
       </w:pPr>
-      <w:hyperlink w:anchor="_Toc244249513" w:history="1">
+      <w:hyperlink w:anchor="_Toc244249889" w:history="1">
         <w:r>
           <w:rPr>
             <w:rStyle w:val="aff9"/>
@@ -2053,7 +2053,7 @@
             <w:noProof/>
             <w:webHidden/>
           </w:rPr>
-          <w:instrText>PAGEREF _Toc244249513 \h</w:instrText>
+          <w:instrText>PAGEREF _Toc244249889 \h</w:instrText>
         </w:r>
         <w:r>
           <w:rPr>
@@ -2111,7 +2111,7 @@
           <w14:ligatures w14:val="standardContextual"/>
         </w:rPr>
       </w:pPr>
-      <w:hyperlink w:anchor="_Toc244249514" w:history="1">
+      <w:hyperlink w:anchor="_Toc244249890" w:history="1">
         <w:r>
           <w:rPr>
             <w:rStyle w:val="aff9"/>
@@ -2148,7 +2148,7 @@
             <w:noProof/>
             <w:webHidden/>
           </w:rPr>
-          <w:instrText>PAGEREF _Toc244249514 \h</w:instrText>
+          <w:instrText>PAGEREF _Toc244249890 \h</w:instrText>
         </w:r>
         <w:r>
           <w:rPr>
@@ -2206,7 +2206,7 @@
           <w14:ligatures w14:val="standardContextual"/>
         </w:rPr>
       </w:pPr>
-      <w:hyperlink w:anchor="_Toc244249515" w:history="1">
+      <w:hyperlink w:anchor="_Toc244249891" w:history="1">
         <w:r>
           <w:rPr>
             <w:rStyle w:val="aff9"/>
@@ -2243,7 +2243,7 @@
             <w:noProof/>
             <w:webHidden/>
           </w:rPr>
-          <w:instrText>PAGEREF _Toc244249515 \h</w:instrText>
+          <w:instrText>PAGEREF _Toc244249891 \h</w:instrText>
         </w:r>
         <w:r>
           <w:rPr>
@@ -2301,7 +2301,7 @@
           <w14:ligatures w14:val="standardContextual"/>
         </w:rPr>
       </w:pPr>
-      <w:hyperlink w:anchor="_Toc244249516" w:history="1">
+      <w:hyperlink w:anchor="_Toc244249892" w:history="1">
         <w:r>
           <w:rPr>
             <w:rStyle w:val="aff9"/>
@@ -2338,7 +2338,7 @@
             <w:noProof/>
             <w:webHidden/>
           </w:rPr>
-          <w:instrText>PAGEREF _Toc244249516 \h</w:instrText>
+          <w:instrText>PAGEREF _Toc244249892 \h</w:instrText>
         </w:r>
         <w:r>
           <w:rPr>
@@ -2396,7 +2396,7 @@
           <w14:ligatures w14:val="standardContextual"/>
         </w:rPr>
       </w:pPr>
-      <w:hyperlink w:anchor="_Toc244249517" w:history="1">
+      <w:hyperlink w:anchor="_Toc244249893" w:history="1">
         <w:r>
           <w:rPr>
             <w:rStyle w:val="aff9"/>
@@ -2433,7 +2433,7 @@
             <w:noProof/>
             <w:webHidden/>
           </w:rPr>
-          <w:instrText>PAGEREF _Toc244249517 \h</w:instrText>
+          <w:instrText>PAGEREF _Toc244249893 \h</w:instrText>
         </w:r>
         <w:r>
           <w:rPr>
@@ -2491,7 +2491,7 @@
           <w14:ligatures w14:val="standardContextual"/>
         </w:rPr>
       </w:pPr>
-      <w:hyperlink w:anchor="_Toc244249518" w:history="1">
+      <w:hyperlink w:anchor="_Toc244249894" w:history="1">
         <w:r>
           <w:rPr>
             <w:rStyle w:val="aff9"/>
@@ -2528,7 +2528,7 @@
             <w:noProof/>
             <w:webHidden/>
           </w:rPr>
-          <w:instrText>PAGEREF _Toc244249518 \h</w:instrText>
+          <w:instrText>PAGEREF _Toc244249894 \h</w:instrText>
         </w:r>
         <w:r>
           <w:rPr>
@@ -2586,7 +2586,7 @@
           <w14:ligatures w14:val="standardContextual"/>
         </w:rPr>
       </w:pPr>
-      <w:hyperlink w:anchor="_Toc244249519" w:history="1">
+      <w:hyperlink w:anchor="_Toc244249895" w:history="1">
         <w:r>
           <w:rPr>
             <w:rStyle w:val="aff9"/>
@@ -2623,7 +2623,7 @@
             <w:noProof/>
             <w:webHidden/>
           </w:rPr>
-          <w:instrText>PAGEREF _Toc244249519 \h</w:instrText>
+          <w:instrText>PAGEREF _Toc244249895 \h</w:instrText>
         </w:r>
         <w:r>
           <w:rPr>
@@ -2681,7 +2681,7 @@
           <w14:ligatures w14:val="standardContextual"/>
         </w:rPr>
       </w:pPr>
-      <w:hyperlink w:anchor="_Toc244249520" w:history="1">
+      <w:hyperlink w:anchor="_Toc244249896" w:history="1">
         <w:r>
           <w:rPr>
             <w:rStyle w:val="aff9"/>
@@ -2718,7 +2718,7 @@
             <w:noProof/>
             <w:webHidden/>
           </w:rPr>
-          <w:instrText>PAGEREF _Toc244249520 \h</w:instrText>
+          <w:instrText>PAGEREF _Toc244249896 \h</w:instrText>
         </w:r>
         <w:r>
           <w:rPr>
@@ -2776,7 +2776,7 @@
           <w14:ligatures w14:val="standardContextual"/>
         </w:rPr>
       </w:pPr>
-      <w:hyperlink w:anchor="_Toc244249521" w:history="1">
+      <w:hyperlink w:anchor="_Toc244249897" w:history="1">
         <w:r>
           <w:rPr>
             <w:rStyle w:val="aff9"/>
@@ -2813,7 +2813,7 @@
             <w:noProof/>
             <w:webHidden/>
           </w:rPr>
-          <w:instrText>PAGEREF _Toc244249521 \h</w:instrText>
+          <w:instrText>PAGEREF _Toc244249897 \h</w:instrText>
         </w:r>
         <w:r>
           <w:rPr>
@@ -2871,7 +2871,7 @@
           <w14:ligatures w14:val="standardContextual"/>
         </w:rPr>
       </w:pPr>
-      <w:hyperlink w:anchor="_Toc244249522" w:history="1">
+      <w:hyperlink w:anchor="_Toc244249898" w:history="1">
         <w:r>
           <w:rPr>
             <w:rStyle w:val="aff9"/>
@@ -2908,7 +2908,7 @@
             <w:noProof/>
             <w:webHidden/>
           </w:rPr>
-          <w:instrText>PAGEREF _Toc244249522 \h</w:instrText>
+          <w:instrText>PAGEREF _Toc244249898 \h</w:instrText>
         </w:r>
         <w:r>
           <w:rPr>
@@ -2966,7 +2966,7 @@
           <w14:ligatures w14:val="standardContextual"/>
         </w:rPr>
       </w:pPr>
-      <w:hyperlink w:anchor="_Toc244249523" w:history="1">
+      <w:hyperlink w:anchor="_Toc244249899" w:history="1">
         <w:r>
           <w:rPr>
             <w:rStyle w:val="aff9"/>
@@ -3003,7 +3003,7 @@
             <w:noProof/>
             <w:webHidden/>
           </w:rPr>
-          <w:instrText>PAGEREF _Toc244249523 \h</w:instrText>
+          <w:instrText>PAGEREF _Toc244249899 \h</w:instrText>
         </w:r>
         <w:r>
           <w:rPr>
@@ -3061,7 +3061,7 @@
           <w14:ligatures w14:val="standardContextual"/>
         </w:rPr>
       </w:pPr>
-      <w:hyperlink w:anchor="_Toc244249524" w:history="1">
+      <w:hyperlink w:anchor="_Toc244249900" w:history="1">
         <w:r>
           <w:rPr>
             <w:rStyle w:val="aff9"/>
@@ -3098,7 +3098,7 @@
             <w:noProof/>
             <w:webHidden/>
           </w:rPr>
-          <w:instrText>PAGEREF _Toc244249524 \h</w:instrText>
+          <w:instrText>PAGEREF _Toc244249900 \h</w:instrText>
         </w:r>
         <w:r>
           <w:rPr>
@@ -3156,7 +3156,7 @@
           <w14:ligatures w14:val="standardContextual"/>
         </w:rPr>
       </w:pPr>
-      <w:hyperlink w:anchor="_Toc244249525" w:history="1">
+      <w:hyperlink w:anchor="_Toc244249901" w:history="1">
         <w:r>
           <w:rPr>
             <w:rStyle w:val="aff9"/>
@@ -3193,7 +3193,7 @@
             <w:noProof/>
             <w:webHidden/>
           </w:rPr>
-          <w:instrText>PAGEREF _Toc244249525 \h</w:instrText>
+          <w:instrText>PAGEREF _Toc244249901 \h</w:instrText>
         </w:r>
         <w:r>
           <w:rPr>
@@ -3251,7 +3251,7 @@
           <w14:ligatures w14:val="standardContextual"/>
         </w:rPr>
       </w:pPr>
-      <w:hyperlink w:anchor="_Toc244249526" w:history="1">
+      <w:hyperlink w:anchor="_Toc244249902" w:history="1">
         <w:r>
           <w:rPr>
             <w:rStyle w:val="aff9"/>
@@ -3288,7 +3288,7 @@
             <w:noProof/>
             <w:webHidden/>
           </w:rPr>
-          <w:instrText>PAGEREF _Toc244249526 \h</w:instrText>
+          <w:instrText>PAGEREF _Toc244249902 \h</w:instrText>
         </w:r>
         <w:r>
           <w:rPr>
@@ -3345,7 +3345,7 @@
           <w14:ligatures w14:val="standardContextual"/>
         </w:rPr>
       </w:pPr>
-      <w:hyperlink w:anchor="_Toc244249527" w:history="1">
+      <w:hyperlink w:anchor="_Toc244249903" w:history="1">
         <w:r>
           <w:rPr>
             <w:rStyle w:val="aff9"/>
@@ -3382,7 +3382,7 @@
             <w:noProof/>
             <w:webHidden/>
           </w:rPr>
-          <w:instrText>PAGEREF _Toc244249527 \h</w:instrText>
+          <w:instrText>PAGEREF _Toc244249903 \h</w:instrText>
         </w:r>
         <w:r>
           <w:rPr>
@@ -3440,7 +3440,7 @@
           <w14:ligatures w14:val="standardContextual"/>
         </w:rPr>
       </w:pPr>
-      <w:hyperlink w:anchor="_Toc244249528" w:history="1">
+      <w:hyperlink w:anchor="_Toc244249904" w:history="1">
         <w:r>
           <w:rPr>
             <w:rStyle w:val="aff9"/>
@@ -3477,7 +3477,7 @@
             <w:noProof/>
             <w:webHidden/>
           </w:rPr>
-          <w:instrText>PAGEREF _Toc244249528 \h</w:instrText>
+          <w:instrText>PAGEREF _Toc244249904 \h</w:instrText>
         </w:r>
         <w:r>
           <w:rPr>
@@ -3535,7 +3535,7 @@
           <w14:ligatures w14:val="standardContextual"/>
         </w:rPr>
       </w:pPr>
-      <w:hyperlink w:anchor="_Toc244249529" w:history="1">
+      <w:hyperlink w:anchor="_Toc244249905" w:history="1">
         <w:r>
           <w:rPr>
             <w:rStyle w:val="aff9"/>
@@ -3572,7 +3572,7 @@
             <w:noProof/>
             <w:webHidden/>
           </w:rPr>
-          <w:instrText>PAGEREF _Toc244249529 \h</w:instrText>
+          <w:instrText>PAGEREF _Toc244249905 \h</w:instrText>
         </w:r>
         <w:r>
           <w:rPr>
@@ -3630,7 +3630,7 @@
           <w14:ligatures w14:val="standardContextual"/>
         </w:rPr>
       </w:pPr>
-      <w:hyperlink w:anchor="_Toc244249530" w:history="1">
+      <w:hyperlink w:anchor="_Toc244249906" w:history="1">
         <w:r>
           <w:rPr>
             <w:rStyle w:val="aff9"/>
@@ -3667,7 +3667,7 @@
             <w:noProof/>
             <w:webHidden/>
           </w:rPr>
-          <w:instrText>PAGEREF _Toc244249530 \h</w:instrText>
+          <w:instrText>PAGEREF _Toc244249906 \h</w:instrText>
         </w:r>
         <w:r>
           <w:rPr>
@@ -3725,7 +3725,7 @@
           <w14:ligatures w14:val="standardContextual"/>
         </w:rPr>
       </w:pPr>
-      <w:hyperlink w:anchor="_Toc244249531" w:history="1">
+      <w:hyperlink w:anchor="_Toc244249907" w:history="1">
         <w:r>
           <w:rPr>
             <w:rStyle w:val="aff9"/>
@@ -3762,7 +3762,7 @@
             <w:noProof/>
             <w:webHidden/>
           </w:rPr>
-          <w:instrText>PAGEREF _Toc244249531 \h</w:instrText>
+          <w:instrText>PAGEREF _Toc244249907 \h</w:instrText>
         </w:r>
         <w:r>
           <w:rPr>
@@ -3820,7 +3820,7 @@
           <w14:ligatures w14:val="standardContextual"/>
         </w:rPr>
       </w:pPr>
-      <w:hyperlink w:anchor="_Toc244249532" w:history="1">
+      <w:hyperlink w:anchor="_Toc244249908" w:history="1">
         <w:r>
           <w:rPr>
             <w:rStyle w:val="aff9"/>
@@ -3857,7 +3857,7 @@
             <w:noProof/>
             <w:webHidden/>
           </w:rPr>
-          <w:instrText>PAGEREF _Toc244249532 \h</w:instrText>
+          <w:instrText>PAGEREF _Toc244249908 \h</w:instrText>
         </w:r>
         <w:r>
           <w:rPr>
@@ -3915,7 +3915,7 @@
           <w14:ligatures w14:val="standardContextual"/>
         </w:rPr>
       </w:pPr>
-      <w:hyperlink w:anchor="_Toc244249533" w:history="1">
+      <w:hyperlink w:anchor="_Toc244249909" w:history="1">
         <w:r>
           <w:rPr>
             <w:rStyle w:val="aff9"/>
@@ -3952,7 +3952,7 @@
             <w:noProof/>
             <w:webHidden/>
           </w:rPr>
-          <w:instrText>PAGEREF _Toc244249533 \h</w:instrText>
+          <w:instrText>PAGEREF _Toc244249909 \h</w:instrText>
         </w:r>
         <w:r>
           <w:rPr>
@@ -4010,7 +4010,7 @@
           <w14:ligatures w14:val="standardContextual"/>
         </w:rPr>
       </w:pPr>
-      <w:hyperlink w:anchor="_Toc244249534" w:history="1">
+      <w:hyperlink w:anchor="_Toc244249910" w:history="1">
         <w:r>
           <w:rPr>
             <w:rStyle w:val="aff9"/>
@@ -4047,7 +4047,7 @@
             <w:noProof/>
             <w:webHidden/>
           </w:rPr>
-          <w:instrText>PAGEREF _Toc244249534 \h</w:instrText>
+          <w:instrText>PAGEREF _Toc244249910 \h</w:instrText>
         </w:r>
         <w:r>
           <w:rPr>
@@ -4105,7 +4105,7 @@
           <w14:ligatures w14:val="standardContextual"/>
         </w:rPr>
       </w:pPr>
-      <w:hyperlink w:anchor="_Toc244249535" w:history="1">
+      <w:hyperlink w:anchor="_Toc244249911" w:history="1">
         <w:r>
           <w:rPr>
             <w:rStyle w:val="aff9"/>
@@ -4142,7 +4142,7 @@
             <w:noProof/>
             <w:webHidden/>
           </w:rPr>
-          <w:instrText>PAGEREF _Toc244249535 \h</w:instrText>
+          <w:instrText>PAGEREF _Toc244249911 \h</w:instrText>
         </w:r>
         <w:r>
           <w:rPr>
@@ -4199,7 +4199,7 @@
           <w14:ligatures w14:val="standardContextual"/>
         </w:rPr>
       </w:pPr>
-      <w:hyperlink w:anchor="_Toc244249536" w:history="1">
+      <w:hyperlink w:anchor="_Toc244249912" w:history="1">
         <w:r>
           <w:rPr>
             <w:rStyle w:val="aff9"/>
@@ -4236,7 +4236,7 @@
             <w:noProof/>
             <w:webHidden/>
           </w:rPr>
-          <w:instrText>PAGEREF _Toc244249536 \h</w:instrText>
+          <w:instrText>PAGEREF _Toc244249912 \h</w:instrText>
         </w:r>
         <w:r>
           <w:rPr>
@@ -4293,7 +4293,7 @@
           <w14:ligatures w14:val="standardContextual"/>
         </w:rPr>
       </w:pPr>
-      <w:hyperlink w:anchor="_Toc244249537" w:history="1">
+      <w:hyperlink w:anchor="_Toc244249913" w:history="1">
         <w:r>
           <w:rPr>
             <w:rStyle w:val="aff9"/>
@@ -4330,7 +4330,7 @@
             <w:noProof/>
             <w:webHidden/>
           </w:rPr>
-          <w:instrText>PAGEREF _Toc244249537 \h</w:instrText>
+          <w:instrText>PAGEREF _Toc244249913 \h</w:instrText>
         </w:r>
         <w:r>
           <w:rPr>
@@ -4387,7 +4387,7 @@
           <w14:ligatures w14:val="standardContextual"/>
         </w:rPr>
       </w:pPr>
-      <w:hyperlink w:anchor="_Toc244249538" w:history="1">
+      <w:hyperlink w:anchor="_Toc244249914" w:history="1">
         <w:r>
           <w:rPr>
             <w:rStyle w:val="aff9"/>
@@ -4424,7 +4424,7 @@
             <w:noProof/>
             <w:webHidden/>
           </w:rPr>
-          <w:instrText>PAGEREF _Toc244249538 \h</w:instrText>
+          <w:instrText>PAGEREF _Toc244249914 \h</w:instrText>
         </w:r>
         <w:r>
           <w:rPr>
@@ -4480,7 +4480,7 @@
       <w:pPr>
         <w:pStyle w:val="1"/>
       </w:pPr>
-      <w:bookmarkStart w:id="1" w:name="_Toc244249498"/>
+      <w:bookmarkStart w:id="1" w:name="_Toc244249874"/>
       <w:r>
         <w:lastRenderedPageBreak/>
         <w:t>1 Introduction</w:t>
@@ -4491,7 +4491,7 @@
       <w:pPr>
         <w:pStyle w:val="21"/>
       </w:pPr>
-      <w:bookmarkStart w:id="2" w:name="_Toc244249499"/>
+      <w:bookmarkStart w:id="2" w:name="_Toc244249875"/>
       <w:r>
         <w:t>1.1 Purpose of Design Definition</w:t>
       </w:r>
@@ -4514,7 +4514,7 @@
       <w:pPr>
         <w:pStyle w:val="21"/>
       </w:pPr>
-      <w:bookmarkStart w:id="3" w:name="_Toc244249500"/>
+      <w:bookmarkStart w:id="3" w:name="_Toc244249876"/>
       <w:r>
         <w:t>1.2 Description of Design Definition</w:t>
       </w:r>
@@ -5390,7 +5390,7 @@
       <w:pPr>
         <w:pStyle w:val="1"/>
       </w:pPr>
-      <w:bookmarkStart w:id="4" w:name="_Toc244249501"/>
+      <w:bookmarkStart w:id="4" w:name="_Toc244249877"/>
       <w:r>
         <w:t>2 Architecture Definition</w:t>
       </w:r>
@@ -5400,7 +5400,7 @@
       <w:pPr>
         <w:pStyle w:val="21"/>
       </w:pPr>
-      <w:bookmarkStart w:id="5" w:name="_Toc244249502"/>
+      <w:bookmarkStart w:id="5" w:name="_Toc244249878"/>
       <w:r>
         <w:t>2.1 Functional Architecture</w:t>
       </w:r>
@@ -5415,7 +5415,7 @@
       <w:pPr>
         <w:pStyle w:val="31"/>
       </w:pPr>
-      <w:bookmarkStart w:id="6" w:name="_Toc244249503"/>
+      <w:bookmarkStart w:id="6" w:name="_Toc244249879"/>
       <w:r>
         <w:t>2.1.1 Functional Architecture Model</w:t>
       </w:r>
@@ -5425,7 +5425,7 @@
       <w:pPr>
         <w:pStyle w:val="4"/>
       </w:pPr>
-      <w:bookmarkStart w:id="7" w:name="_Toc244249504"/>
+      <w:bookmarkStart w:id="7" w:name="_Toc244249880"/>
       <w:r>
         <w:t>2.1.1.1 Function Elements</w:t>
       </w:r>
@@ -6918,7 +6918,7 @@
       <w:pPr>
         <w:pStyle w:val="4"/>
       </w:pPr>
-      <w:bookmarkStart w:id="8" w:name="_Toc244249505"/>
+      <w:bookmarkStart w:id="8" w:name="_Toc244249881"/>
       <w:r>
         <w:t>2.1.1.2 ICOM Summary for the First-Level and Second-Level Models</w:t>
       </w:r>
@@ -8322,7 +8322,7 @@
       <w:pPr>
         <w:pStyle w:val="4"/>
       </w:pPr>
-      <w:bookmarkStart w:id="9" w:name="_Toc244249506"/>
+      <w:bookmarkStart w:id="9" w:name="_Toc244249882"/>
       <w:r>
         <w:t>2.1.1.3 Choice of the Function to Decompose</w:t>
       </w:r>
@@ -9386,7 +9386,7 @@
       <w:pPr>
         <w:pStyle w:val="4"/>
       </w:pPr>
-      <w:bookmarkStart w:id="10" w:name="_Toc244249507"/>
+      <w:bookmarkStart w:id="10" w:name="_Toc244249883"/>
       <w:r>
         <w:t>2.1.1.4 Decomposition of F.2.2 into Second-Level Functions</w:t>
       </w:r>
@@ -9622,7 +9622,7 @@
       <w:pPr>
         <w:pStyle w:val="31"/>
       </w:pPr>
-      <w:bookmarkStart w:id="11" w:name="_Toc244249508"/>
+      <w:bookmarkStart w:id="11" w:name="_Toc244249884"/>
       <w:r>
         <w:lastRenderedPageBreak/>
         <w:t>2.1.2 Functional Interface</w:t>
@@ -9633,7 +9633,7 @@
       <w:pPr>
         <w:pStyle w:val="4"/>
       </w:pPr>
-      <w:bookmarkStart w:id="12" w:name="_Toc244249509"/>
+      <w:bookmarkStart w:id="12" w:name="_Toc244249885"/>
       <w:r>
         <w:t>2.1.2.1 N2 Diagram</w:t>
       </w:r>
@@ -9658,7 +9658,7 @@
           <w:noProof/>
         </w:rPr>
         <w:drawing>
-          <wp:inline distT="0" distB="0" distL="0" distR="0" wp14:anchorId="2E01B949" wp14:editId="132E0043">
+          <wp:inline distT="0" distB="0" distL="0" distR="0" wp14:anchorId="7FA0E732" wp14:editId="5AD2617F">
             <wp:extent cx="5577840" cy="5577840"/>
             <wp:effectExtent l="0" t="0" r="0" b="0"/>
             <wp:docPr id="1" name="Picture 1"/>
@@ -9714,7 +9714,7 @@
         </w:rPr>
         <w:lastRenderedPageBreak/>
         <w:drawing>
-          <wp:inline distT="0" distB="0" distL="0" distR="0" wp14:anchorId="66CCC80B" wp14:editId="59232AF2">
+          <wp:inline distT="0" distB="0" distL="0" distR="0" wp14:anchorId="53F33A8C" wp14:editId="3519FEE7">
             <wp:extent cx="4206240" cy="4206240"/>
             <wp:effectExtent l="0" t="0" r="0" b="0"/>
             <wp:docPr id="2" name="Picture 2"/>
@@ -9762,7 +9762,7 @@
       <w:pPr>
         <w:pStyle w:val="4"/>
       </w:pPr>
-      <w:bookmarkStart w:id="13" w:name="_Toc244249510"/>
+      <w:bookmarkStart w:id="13" w:name="_Toc244249886"/>
       <w:r>
         <w:t>2.1.2.2 Input/Output Elements</w:t>
       </w:r>
@@ -11196,7 +11196,7 @@
       <w:pPr>
         <w:pStyle w:val="31"/>
       </w:pPr>
-      <w:bookmarkStart w:id="14" w:name="_Toc244249511"/>
+      <w:bookmarkStart w:id="14" w:name="_Toc244249887"/>
       <w:r>
         <w:t>2.1.3 Sequence of Operations</w:t>
       </w:r>
@@ -11206,7 +11206,7 @@
       <w:pPr>
         <w:pStyle w:val="4"/>
       </w:pPr>
-      <w:bookmarkStart w:id="15" w:name="_Toc244249512"/>
+      <w:bookmarkStart w:id="15" w:name="_Toc244249888"/>
       <w:r>
         <w:t>2.1.3.1 Scenario Overview</w:t>
       </w:r>
@@ -11231,7 +11231,7 @@
           <w:noProof/>
         </w:rPr>
         <w:drawing>
-          <wp:inline distT="0" distB="0" distL="0" distR="0" wp14:anchorId="35335916" wp14:editId="0DED6C4C">
+          <wp:inline distT="0" distB="0" distL="0" distR="0" wp14:anchorId="4154A8ED" wp14:editId="67E17119">
             <wp:extent cx="5120640" cy="2154042"/>
             <wp:effectExtent l="0" t="0" r="0" b="0"/>
             <wp:docPr id="3" name="Picture 3"/>
@@ -11851,7 +11851,7 @@
       <w:pPr>
         <w:pStyle w:val="4"/>
       </w:pPr>
-      <w:bookmarkStart w:id="16" w:name="_Toc244249513"/>
+      <w:bookmarkStart w:id="16" w:name="_Toc244249889"/>
       <w:r>
         <w:t>2.1.3.2 Detailed Sequence of Interactions</w:t>
       </w:r>
@@ -11877,7 +11877,7 @@
           <w:noProof/>
         </w:rPr>
         <w:drawing>
-          <wp:inline distT="0" distB="0" distL="0" distR="0" wp14:anchorId="68606823" wp14:editId="55880053">
+          <wp:inline distT="0" distB="0" distL="0" distR="0" wp14:anchorId="4EBCC697" wp14:editId="3B1B6805">
             <wp:extent cx="6400800" cy="5550858"/>
             <wp:effectExtent l="0" t="0" r="0" b="0"/>
             <wp:docPr id="4" name="Picture 4"/>
@@ -11933,7 +11933,7 @@
         </w:rPr>
         <w:lastRenderedPageBreak/>
         <w:drawing>
-          <wp:inline distT="0" distB="0" distL="0" distR="0" wp14:anchorId="5D81426C" wp14:editId="42DE1402">
+          <wp:inline distT="0" distB="0" distL="0" distR="0" wp14:anchorId="25726780" wp14:editId="30F9719E">
             <wp:extent cx="6400800" cy="4018863"/>
             <wp:effectExtent l="0" t="0" r="0" b="0"/>
             <wp:docPr id="5" name="Picture 5"/>
@@ -11981,7 +11981,7 @@
       <w:pPr>
         <w:pStyle w:val="4"/>
       </w:pPr>
-      <w:bookmarkStart w:id="17" w:name="_Toc244249514"/>
+      <w:bookmarkStart w:id="17" w:name="_Toc244249890"/>
       <w:r>
         <w:t>2.1.3.3 Consistency with IDEF0 and the N2 Diagram</w:t>
       </w:r>
@@ -14249,7 +14249,7 @@
       <w:pPr>
         <w:pStyle w:val="21"/>
       </w:pPr>
-      <w:bookmarkStart w:id="18" w:name="_Toc244249515"/>
+      <w:bookmarkStart w:id="18" w:name="_Toc244249891"/>
       <w:r>
         <w:t>2.2 Physical Architecture</w:t>
       </w:r>
@@ -14259,7 +14259,7 @@
       <w:pPr>
         <w:pStyle w:val="31"/>
       </w:pPr>
-      <w:bookmarkStart w:id="19" w:name="_Toc244249516"/>
+      <w:bookmarkStart w:id="19" w:name="_Toc244249892"/>
       <w:r>
         <w:t>2.2.1 Physical Architecture Model</w:t>
       </w:r>
@@ -14269,7 +14269,7 @@
       <w:pPr>
         <w:pStyle w:val="4"/>
       </w:pPr>
-      <w:bookmarkStart w:id="20" w:name="_Toc244249517"/>
+      <w:bookmarkStart w:id="20" w:name="_Toc244249893"/>
       <w:r>
         <w:t>2.2.1.1 Physical Elements</w:t>
       </w:r>
@@ -15438,7 +15438,7 @@
         </w:rPr>
         <w:lastRenderedPageBreak/>
         <w:drawing>
-          <wp:inline distT="0" distB="0" distL="0" distR="0" wp14:anchorId="5CB26458" wp14:editId="42C07915">
+          <wp:inline distT="0" distB="0" distL="0" distR="0" wp14:anchorId="6C888540" wp14:editId="4C6CD3B2">
             <wp:extent cx="5669280" cy="5271927"/>
             <wp:effectExtent l="0" t="0" r="0" b="0"/>
             <wp:docPr id="6" name="Picture 6"/>
@@ -15506,7 +15506,7 @@
         </w:rPr>
         <w:lastRenderedPageBreak/>
         <w:drawing>
-          <wp:inline distT="0" distB="0" distL="0" distR="0" wp14:anchorId="6CF1F0CB" wp14:editId="18AF979B">
+          <wp:inline distT="0" distB="0" distL="0" distR="0" wp14:anchorId="06023FCA" wp14:editId="1F55DFFB">
             <wp:extent cx="8595360" cy="6236811"/>
             <wp:effectExtent l="0" t="0" r="0" b="0"/>
             <wp:docPr id="7" name="Picture 7"/>
@@ -15562,7 +15562,7 @@
         </w:rPr>
         <w:lastRenderedPageBreak/>
         <w:drawing>
-          <wp:inline distT="0" distB="0" distL="0" distR="0" wp14:anchorId="2357D287" wp14:editId="7B3447E0">
+          <wp:inline distT="0" distB="0" distL="0" distR="0" wp14:anchorId="3C7E717B" wp14:editId="59D45898">
             <wp:extent cx="8229600" cy="5130710"/>
             <wp:effectExtent l="0" t="0" r="0" b="0"/>
             <wp:docPr id="8" name="Picture 8"/>
@@ -16526,7 +16526,7 @@
       <w:pPr>
         <w:pStyle w:val="4"/>
       </w:pPr>
-      <w:bookmarkStart w:id="21" w:name="_Toc244249518"/>
+      <w:bookmarkStart w:id="21" w:name="_Toc244249894"/>
       <w:r>
         <w:t>2.2.1.2 Asset Hierarchy Diagrams</w:t>
       </w:r>
@@ -16564,7 +16564,7 @@
         </w:rPr>
         <w:lastRenderedPageBreak/>
         <w:drawing>
-          <wp:inline distT="0" distB="0" distL="0" distR="0" wp14:anchorId="1FB65D7B" wp14:editId="322CE9F6">
+          <wp:inline distT="0" distB="0" distL="0" distR="0" wp14:anchorId="4257A20D" wp14:editId="36F0969A">
             <wp:extent cx="8412480" cy="2920744"/>
             <wp:effectExtent l="0" t="0" r="0" b="0"/>
             <wp:docPr id="9" name="Picture 9"/>
@@ -16619,7 +16619,7 @@
           <w:noProof/>
         </w:rPr>
         <w:drawing>
-          <wp:inline distT="0" distB="0" distL="0" distR="0" wp14:anchorId="001857A4" wp14:editId="40E6D6D1">
+          <wp:inline distT="0" distB="0" distL="0" distR="0" wp14:anchorId="46CE6F88" wp14:editId="78998939">
             <wp:extent cx="7315200" cy="1595787"/>
             <wp:effectExtent l="0" t="0" r="0" b="0"/>
             <wp:docPr id="10" name="Picture 10"/>
@@ -16675,7 +16675,7 @@
         </w:rPr>
         <w:lastRenderedPageBreak/>
         <w:drawing>
-          <wp:inline distT="0" distB="0" distL="0" distR="0" wp14:anchorId="72CBD828" wp14:editId="113061E8">
+          <wp:inline distT="0" distB="0" distL="0" distR="0" wp14:anchorId="35324139" wp14:editId="63FD08BD">
             <wp:extent cx="8412480" cy="3176679"/>
             <wp:effectExtent l="0" t="0" r="0" b="0"/>
             <wp:docPr id="11" name="Picture 11"/>
@@ -16743,7 +16743,7 @@
         </w:rPr>
         <w:lastRenderedPageBreak/>
         <w:drawing>
-          <wp:inline distT="0" distB="0" distL="0" distR="0" wp14:anchorId="0828C000" wp14:editId="1E5A74C0">
+          <wp:inline distT="0" distB="0" distL="0" distR="0" wp14:anchorId="7D451D1D" wp14:editId="5F7AD54C">
             <wp:extent cx="5852160" cy="2470001"/>
             <wp:effectExtent l="0" t="0" r="0" b="0"/>
             <wp:docPr id="12" name="Picture 12"/>
@@ -16791,7 +16791,7 @@
       <w:pPr>
         <w:pStyle w:val="4"/>
       </w:pPr>
-      <w:bookmarkStart w:id="22" w:name="_Toc244249519"/>
+      <w:bookmarkStart w:id="22" w:name="_Toc244249895"/>
       <w:r>
         <w:t>2.2.1.3 Non-Functional Considerations</w:t>
       </w:r>
@@ -19165,7 +19165,7 @@
       <w:pPr>
         <w:pStyle w:val="4"/>
       </w:pPr>
-      <w:bookmarkStart w:id="23" w:name="_Toc244249520"/>
+      <w:bookmarkStart w:id="23" w:name="_Toc244249896"/>
       <w:r>
         <w:t>2.2.1.4 Insights on the Mechanisms</w:t>
       </w:r>
@@ -20095,7 +20095,7 @@
       <w:pPr>
         <w:pStyle w:val="31"/>
       </w:pPr>
-      <w:bookmarkStart w:id="24" w:name="_Toc244249521"/>
+      <w:bookmarkStart w:id="24" w:name="_Toc244249897"/>
       <w:r>
         <w:t>2.2.2 Physical Interface</w:t>
       </w:r>
@@ -20105,7 +20105,7 @@
       <w:pPr>
         <w:pStyle w:val="4"/>
       </w:pPr>
-      <w:bookmarkStart w:id="25" w:name="_Toc244249522"/>
+      <w:bookmarkStart w:id="25" w:name="_Toc244249898"/>
       <w:r>
         <w:t>2.2.2.1 Asset Diagrams and I-Square Diagram</w:t>
       </w:r>
@@ -20929,7 +20929,7 @@
           <w:noProof/>
         </w:rPr>
         <w:drawing>
-          <wp:inline distT="0" distB="0" distL="0" distR="0" wp14:anchorId="0F3DBECC" wp14:editId="4ECD51CE">
+          <wp:inline distT="0" distB="0" distL="0" distR="0" wp14:anchorId="0655B6E1" wp14:editId="2155894B">
             <wp:extent cx="5303520" cy="4101589"/>
             <wp:effectExtent l="0" t="0" r="0" b="0"/>
             <wp:docPr id="13" name="Picture 13"/>
@@ -20997,7 +20997,7 @@
         </w:rPr>
         <w:lastRenderedPageBreak/>
         <w:drawing>
-          <wp:inline distT="0" distB="0" distL="0" distR="0" wp14:anchorId="35C8206E" wp14:editId="5990F892">
+          <wp:inline distT="0" distB="0" distL="0" distR="0" wp14:anchorId="6980B485" wp14:editId="099A4DF4">
             <wp:extent cx="5852160" cy="5818175"/>
             <wp:effectExtent l="0" t="0" r="0" b="0"/>
             <wp:docPr id="14" name="Picture 14"/>
@@ -23521,7 +23521,7 @@
         </w:rPr>
         <w:lastRenderedPageBreak/>
         <w:drawing>
-          <wp:inline distT="0" distB="0" distL="0" distR="0" wp14:anchorId="299CE65C" wp14:editId="033E31CA">
+          <wp:inline distT="0" distB="0" distL="0" distR="0" wp14:anchorId="7FAD31E0" wp14:editId="325F4CF8">
             <wp:extent cx="5577840" cy="5577840"/>
             <wp:effectExtent l="0" t="0" r="0" b="0"/>
             <wp:docPr id="15" name="Picture 15"/>
@@ -23589,7 +23589,7 @@
         </w:rPr>
         <w:lastRenderedPageBreak/>
         <w:drawing>
-          <wp:inline distT="0" distB="0" distL="0" distR="0" wp14:anchorId="0408C81C" wp14:editId="5FF196B7">
+          <wp:inline distT="0" distB="0" distL="0" distR="0" wp14:anchorId="0D18A3D5" wp14:editId="0551DEC6">
             <wp:extent cx="4206240" cy="4206240"/>
             <wp:effectExtent l="0" t="0" r="0" b="0"/>
             <wp:docPr id="16" name="Picture 16"/>
@@ -23637,7 +23637,7 @@
       <w:pPr>
         <w:pStyle w:val="21"/>
       </w:pPr>
-      <w:bookmarkStart w:id="26" w:name="_Toc244249523"/>
+      <w:bookmarkStart w:id="26" w:name="_Toc244249899"/>
       <w:r>
         <w:t>2.3 Architecture Evaluation</w:t>
       </w:r>
@@ -23647,7 +23647,7 @@
       <w:pPr>
         <w:pStyle w:val="31"/>
       </w:pPr>
-      <w:bookmarkStart w:id="27" w:name="_Toc244249524"/>
+      <w:bookmarkStart w:id="27" w:name="_Toc244249900"/>
       <w:r>
         <w:t>2.3.1 Analysis against Functional Architecture</w:t>
       </w:r>
@@ -24116,7 +24116,7 @@
       <w:pPr>
         <w:pStyle w:val="21"/>
       </w:pPr>
-      <w:bookmarkStart w:id="28" w:name="_Toc244249525"/>
+      <w:bookmarkStart w:id="28" w:name="_Toc244249901"/>
       <w:r>
         <w:t>2.4 Alternative Physical Architectures</w:t>
       </w:r>
@@ -24126,7 +24126,7 @@
       <w:pPr>
         <w:pStyle w:val="31"/>
       </w:pPr>
-      <w:bookmarkStart w:id="29" w:name="_Toc244249526"/>
+      <w:bookmarkStart w:id="29" w:name="_Toc244249902"/>
       <w:r>
         <w:t>2.4.1 Evaluation of Physical Alternatives</w:t>
       </w:r>
@@ -25378,7 +25378,7 @@
         </w:rPr>
         <w:lastRenderedPageBreak/>
         <w:drawing>
-          <wp:inline distT="0" distB="0" distL="0" distR="0" wp14:anchorId="522FD252" wp14:editId="0FA47B45">
+          <wp:inline distT="0" distB="0" distL="0" distR="0" wp14:anchorId="30DC14D8" wp14:editId="06185DD1">
             <wp:extent cx="4572000" cy="2032000"/>
             <wp:effectExtent l="0" t="0" r="0" b="0"/>
             <wp:docPr id="17" name="Picture 17"/>
@@ -25464,7 +25464,7 @@
       <w:pPr>
         <w:pStyle w:val="1"/>
       </w:pPr>
-      <w:bookmarkStart w:id="30" w:name="_Toc244249527"/>
+      <w:bookmarkStart w:id="30" w:name="_Toc244249903"/>
       <w:r>
         <w:t>3 System Requirements Management</w:t>
       </w:r>
@@ -25474,7 +25474,7 @@
       <w:pPr>
         <w:pStyle w:val="21"/>
       </w:pPr>
-      <w:bookmarkStart w:id="31" w:name="_Toc244249528"/>
+      <w:bookmarkStart w:id="31" w:name="_Toc244249904"/>
       <w:r>
         <w:t>3.1 Requirements Traceability</w:t>
       </w:r>
@@ -25889,7 +25889,7 @@
           <w:noProof/>
         </w:rPr>
         <w:drawing>
-          <wp:inline distT="0" distB="0" distL="0" distR="0" wp14:anchorId="3419B3A0" wp14:editId="590CC562">
+          <wp:inline distT="0" distB="0" distL="0" distR="0" wp14:anchorId="6FD3C901" wp14:editId="2AD32067">
             <wp:extent cx="6126480" cy="5745896"/>
             <wp:effectExtent l="0" t="0" r="0" b="0"/>
             <wp:docPr id="18" name="Picture 18"/>
@@ -27623,7 +27623,7 @@
       <w:pPr>
         <w:pStyle w:val="21"/>
       </w:pPr>
-      <w:bookmarkStart w:id="32" w:name="_Toc244249529"/>
+      <w:bookmarkStart w:id="32" w:name="_Toc244249905"/>
       <w:r>
         <w:t>3.2 System Design Output Requirements</w:t>
       </w:r>
@@ -27633,7 +27633,7 @@
       <w:pPr>
         <w:pStyle w:val="31"/>
       </w:pPr>
-      <w:bookmarkStart w:id="33" w:name="_Toc244249530"/>
+      <w:bookmarkStart w:id="33" w:name="_Toc244249906"/>
       <w:r>
         <w:t>3.2.1 Methodology for Deriving System Design Output Requirements</w:t>
       </w:r>
@@ -27756,7 +27756,7 @@
       <w:pPr>
         <w:pStyle w:val="31"/>
       </w:pPr>
-      <w:bookmarkStart w:id="34" w:name="_Toc244249531"/>
+      <w:bookmarkStart w:id="34" w:name="_Toc244249907"/>
       <w:r>
         <w:t>3.2.2 Detailed System Design Output Requirements</w:t>
       </w:r>
@@ -27766,7 +27766,7 @@
       <w:pPr>
         <w:pStyle w:val="4"/>
       </w:pPr>
-      <w:bookmarkStart w:id="35" w:name="_Toc244249532"/>
+      <w:bookmarkStart w:id="35" w:name="_Toc244249908"/>
       <w:r>
         <w:t>3.2.2.1 Subsystem Design Output Requirements</w:t>
       </w:r>
@@ -27781,7 +27781,7 @@
       <w:pPr>
         <w:pStyle w:val="4"/>
       </w:pPr>
-      <w:bookmarkStart w:id="36" w:name="_Toc244249533"/>
+      <w:bookmarkStart w:id="36" w:name="_Toc244249909"/>
       <w:r>
         <w:t>3.2.2.2 Component Specification for the Reference Data Subsystem</w:t>
       </w:r>
@@ -29436,7 +29436,7 @@
       <w:pPr>
         <w:pStyle w:val="4"/>
       </w:pPr>
-      <w:bookmarkStart w:id="37" w:name="_Toc244249534"/>
+      <w:bookmarkStart w:id="37" w:name="_Toc244249910"/>
       <w:r>
         <w:t>3.2.2.3 System-Wide Requirements Flow-Down</w:t>
       </w:r>
@@ -33633,7 +33633,7 @@
       <w:pPr>
         <w:pStyle w:val="31"/>
       </w:pPr>
-      <w:bookmarkStart w:id="38" w:name="_Toc244249535"/>
+      <w:bookmarkStart w:id="38" w:name="_Toc244249911"/>
       <w:r>
         <w:t>3.2.3 Summary Table of System Design Output Requirements</w:t>
       </w:r>
@@ -35254,7 +35254,7 @@
       <w:pPr>
         <w:pStyle w:val="1"/>
       </w:pPr>
-      <w:bookmarkStart w:id="39" w:name="_Toc244249536"/>
+      <w:bookmarkStart w:id="39" w:name="_Toc244249912"/>
       <w:r>
         <w:lastRenderedPageBreak/>
         <w:t>4 Summary</w:t>
@@ -35289,7 +35289,7 @@
       <w:pPr>
         <w:pStyle w:val="1"/>
       </w:pPr>
-      <w:bookmarkStart w:id="40" w:name="_Toc244249537"/>
+      <w:bookmarkStart w:id="40" w:name="_Toc244249913"/>
       <w:r>
         <w:t>Appendix A. Model Assessment Check</w:t>
       </w:r>
@@ -36420,7 +36420,7 @@
       <w:pPr>
         <w:pStyle w:val="1"/>
       </w:pPr>
-      <w:bookmarkStart w:id="41" w:name="_Toc244249538"/>
+      <w:bookmarkStart w:id="41" w:name="_Toc244249914"/>
       <w:r>
         <w:t>Appendix B. Model Baseline and Figure Sources</w:t>
       </w:r>
@@ -38284,31 +38284,31 @@
       </w:rPr>
     </w:lvl>
   </w:abstractNum>
-  <w:num w:numId="1" w16cid:durableId="360209625">
+  <w:num w:numId="1" w16cid:durableId="1368337694">
     <w:abstractNumId w:val="8"/>
   </w:num>
-  <w:num w:numId="2" w16cid:durableId="14549731">
+  <w:num w:numId="2" w16cid:durableId="2072188167">
     <w:abstractNumId w:val="6"/>
   </w:num>
-  <w:num w:numId="3" w16cid:durableId="1980302916">
+  <w:num w:numId="3" w16cid:durableId="791903495">
     <w:abstractNumId w:val="5"/>
   </w:num>
-  <w:num w:numId="4" w16cid:durableId="2063288867">
+  <w:num w:numId="4" w16cid:durableId="2076387674">
     <w:abstractNumId w:val="4"/>
   </w:num>
-  <w:num w:numId="5" w16cid:durableId="582224413">
+  <w:num w:numId="5" w16cid:durableId="703483079">
     <w:abstractNumId w:val="7"/>
   </w:num>
-  <w:num w:numId="6" w16cid:durableId="1471944881">
+  <w:num w:numId="6" w16cid:durableId="1612515937">
     <w:abstractNumId w:val="3"/>
   </w:num>
-  <w:num w:numId="7" w16cid:durableId="291718380">
+  <w:num w:numId="7" w16cid:durableId="1918512583">
     <w:abstractNumId w:val="2"/>
   </w:num>
-  <w:num w:numId="8" w16cid:durableId="349838397">
+  <w:num w:numId="8" w16cid:durableId="1893232259">
     <w:abstractNumId w:val="1"/>
   </w:num>
-  <w:num w:numId="9" w16cid:durableId="729769835">
+  <w:num w:numId="9" w16cid:durableId="170871960">
     <w:abstractNumId w:val="0"/>
   </w:num>
 </w:numbering>
@@ -49695,7 +49695,7 @@
     <w:autoRedefine/>
     <w:uiPriority w:val="39"/>
     <w:unhideWhenUsed/>
-    <w:rsid w:val="00B62C26"/>
+    <w:rsid w:val="002B2924"/>
   </w:style>
   <w:style w:type="paragraph" w:styleId="TOC2">
     <w:name w:val="toc 2"/>
@@ -49704,7 +49704,7 @@
     <w:autoRedefine/>
     <w:uiPriority w:val="39"/>
     <w:unhideWhenUsed/>
-    <w:rsid w:val="00B62C26"/>
+    <w:rsid w:val="002B2924"/>
     <w:pPr>
       <w:ind w:leftChars="200" w:left="420"/>
     </w:pPr>
@@ -49716,7 +49716,7 @@
     <w:autoRedefine/>
     <w:uiPriority w:val="39"/>
     <w:unhideWhenUsed/>
-    <w:rsid w:val="00B62C26"/>
+    <w:rsid w:val="002B2924"/>
     <w:pPr>
       <w:ind w:leftChars="400" w:left="840"/>
     </w:pPr>
@@ -49728,7 +49728,7 @@
     <w:autoRedefine/>
     <w:uiPriority w:val="39"/>
     <w:unhideWhenUsed/>
-    <w:rsid w:val="00B62C26"/>
+    <w:rsid w:val="002B2924"/>
     <w:pPr>
       <w:ind w:leftChars="600" w:left="1260"/>
     </w:pPr>
@@ -49738,7 +49738,7 @@
     <w:basedOn w:val="a2"/>
     <w:uiPriority w:val="99"/>
     <w:unhideWhenUsed/>
-    <w:rsid w:val="00B62C26"/>
+    <w:rsid w:val="002B2924"/>
     <w:rPr>
       <w:color w:val="0000FF" w:themeColor="hyperlink"/>
       <w:u w:val="single"/>

</xml_diff>